<commit_message>
Fix the version-control row number and the LP table of contents
QA audit on the v4 build found two problems introduced by the previous commit:

* The new Document Version Control Record row was numbered 3, duplicating the
  existing "Corrected the assessment model" row, so the LG and LP each had two
  rows labelled 3 and none labelled 4 while their covers said Version 4.
  Renumbered to 4 in both builders.

* The LP table of contents showed every entry as page 4 (and the new Lab Data
  Files entry as page 1). inject_toc.py resolves headings against the rendered
  PDF, and the new "Lab Data Files and Materials" heading had been added after
  that PDF was produced, so the lookup fell through to its default. Re-ran the
  generate/render/inject/re-render cycle; all 11 entries now resolve to real
  ascending pages 6..13.

Co-Authored-By: Claude Opus 5 <noreply@anthropic.com>
</commit_message>
<xml_diff>
--- a/courseware/LP-Certified Lean Six Sigma Black Belt (CLSSBB) Training.docx
+++ b/courseware/LP-Certified Lean Six Sigma Black Belt (CLSSBB) Training.docx
@@ -468,7 +468,7 @@
               <w:rPr>
                 <w:sz w:val="19"/>
               </w:rPr>
-              <w:t>3</w:t>
+              <w:t>4</w:t>
             </w:r>
           </w:p>
         </w:tc>
@@ -550,7 +550,7 @@
         </w:rPr>
         <w:t>Course Information</w:t>
         <w:tab/>
-        <w:t>4</w:t>
+        <w:t>6</w:t>
       </w:r>
     </w:p>
     <w:p>
@@ -569,7 +569,7 @@
         </w:rPr>
         <w:t>Learning Outcomes</w:t>
         <w:tab/>
-        <w:t>4</w:t>
+        <w:t>6</w:t>
       </w:r>
     </w:p>
     <w:p>
@@ -588,7 +588,7 @@
         </w:rPr>
         <w:t>Assessment</w:t>
         <w:tab/>
-        <w:t>4</w:t>
+        <w:t>6</w:t>
       </w:r>
     </w:p>
     <w:p>
@@ -607,7 +607,7 @@
         </w:rPr>
         <w:t>Course Schedule</w:t>
         <w:tab/>
-        <w:t>4</w:t>
+        <w:t>7</w:t>
       </w:r>
     </w:p>
     <w:p>
@@ -627,7 +627,7 @@
         </w:rPr>
         <w:t>Day 1 — The Black Belt role, portfolio selection, capstone chartering and Define</w:t>
         <w:tab/>
-        <w:t>4</w:t>
+        <w:t>7</w:t>
       </w:r>
     </w:p>
     <w:p>
@@ -647,7 +647,7 @@
         </w:rPr>
         <w:t>Day 2 — Measure — advanced measurement systems, attribute MSA and capability</w:t>
         <w:tab/>
-        <w:t>4</w:t>
+        <w:t>8</w:t>
       </w:r>
     </w:p>
     <w:p>
@@ -667,7 +667,7 @@
         </w:rPr>
         <w:t>Day 3 — Analyze — multiple regression, ANOVA, non-parametric and multi-vari</w:t>
         <w:tab/>
-        <w:t>4</w:t>
+        <w:t>9</w:t>
       </w:r>
     </w:p>
     <w:p>
@@ -687,7 +687,7 @@
         </w:rPr>
         <w:t>Day 4 — Improve and Control — DOE, RSM and advanced SPC</w:t>
         <w:tab/>
-        <w:t>4</w:t>
+        <w:t>10</w:t>
       </w:r>
     </w:p>
     <w:p>
@@ -707,7 +707,7 @@
         </w:rPr>
         <w:t>Day 5 — Capstone project consolidation and steering committee presentation</w:t>
         <w:tab/>
-        <w:t>4</w:t>
+        <w:t>11</w:t>
       </w:r>
     </w:p>
     <w:p>
@@ -726,7 +726,7 @@
         </w:rPr>
         <w:t>Lab Reference (aligned to the DMAIC phases)</w:t>
         <w:tab/>
-        <w:t>4</w:t>
+        <w:t>12</w:t>
       </w:r>
     </w:p>
     <w:p>
@@ -745,7 +745,7 @@
         </w:rPr>
         <w:t>Lab Data Files and Materials</w:t>
         <w:tab/>
-        <w:t>1</w:t>
+        <w:t>13</w:t>
       </w:r>
     </w:p>
     <w:p>

</xml_diff>